<commit_message>
release: prepare V1.6.17 instruction and runtime update
</commit_message>
<xml_diff>
--- a/skills/high-tech-enterprise-application-drafting/assets/高新技术企业认定申请书空白模板.docx
+++ b/skills/high-tech-enterprise-application-drafting/assets/高新技术企业认定申请书空白模板.docx
@@ -7845,16 +7845,6 @@
               </w:rPr>
             </w:pPr>
           </w:p>
-          <w:p>
-            <w:pPr>
-              <w:spacing w:line="300" w:lineRule="auto"/>
-              <w:ind w:firstLine="0" w:firstLineChars="0"/>
-              <w:rPr>
-                <w:sz w:val="28"/>
-                <w:szCs w:val="28"/>
-              </w:rPr>
-            </w:pPr>
-          </w:p>
         </w:tc>
         <w:tc>
           <w:tcPr>
@@ -7979,16 +7969,6 @@
               </w:rPr>
             </w:pPr>
           </w:p>
-          <w:p>
-            <w:pPr>
-              <w:spacing w:line="300" w:lineRule="auto"/>
-              <w:ind w:firstLine="0" w:firstLineChars="0"/>
-              <w:rPr>
-                <w:sz w:val="28"/>
-                <w:szCs w:val="28"/>
-              </w:rPr>
-            </w:pPr>
-          </w:p>
         </w:tc>
         <w:tc>
           <w:tcPr>
@@ -8113,16 +8093,6 @@
               </w:rPr>
             </w:pPr>
           </w:p>
-          <w:p>
-            <w:pPr>
-              <w:spacing w:line="300" w:lineRule="auto"/>
-              <w:ind w:firstLine="0" w:firstLineChars="0"/>
-              <w:rPr>
-                <w:sz w:val="28"/>
-                <w:szCs w:val="28"/>
-              </w:rPr>
-            </w:pPr>
-          </w:p>
         </w:tc>
         <w:tc>
           <w:tcPr>
@@ -8247,16 +8217,6 @@
               </w:rPr>
             </w:pPr>
           </w:p>
-          <w:p>
-            <w:pPr>
-              <w:spacing w:line="300" w:lineRule="auto"/>
-              <w:ind w:firstLine="0" w:firstLineChars="0"/>
-              <w:rPr>
-                <w:sz w:val="28"/>
-                <w:szCs w:val="28"/>
-              </w:rPr>
-            </w:pPr>
-          </w:p>
         </w:tc>
         <w:tc>
           <w:tcPr>
@@ -8381,16 +8341,6 @@
               </w:rPr>
             </w:pPr>
           </w:p>
-          <w:p>
-            <w:pPr>
-              <w:spacing w:line="300" w:lineRule="auto"/>
-              <w:ind w:firstLine="0" w:firstLineChars="0"/>
-              <w:rPr>
-                <w:sz w:val="28"/>
-                <w:szCs w:val="28"/>
-              </w:rPr>
-            </w:pPr>
-          </w:p>
         </w:tc>
         <w:tc>
           <w:tcPr>
@@ -8505,16 +8455,6 @@
             <w:noWrap w:val="0"/>
             <w:vAlign w:val="top"/>
           </w:tcPr>
-          <w:p>
-            <w:pPr>
-              <w:spacing w:line="300" w:lineRule="auto"/>
-              <w:ind w:firstLine="0" w:firstLineChars="0"/>
-              <w:rPr>
-                <w:sz w:val="28"/>
-                <w:szCs w:val="28"/>
-              </w:rPr>
-            </w:pPr>
-          </w:p>
           <w:p>
             <w:pPr>
               <w:spacing w:line="300" w:lineRule="auto"/>

</xml_diff>